<commit_message>
Sigil OLED: Unpair and Factory reset under Device recovery
The OLED Menu list now ends with Sleep, Device recovery and Back. Device
recovery opens a second list (titled RECOVERY) holding Unpair, Factory
reset and Back, so the erasing entries sit one level away from play. Back
or Left returns to the Device recovery row. The e-ink compass device menu
is unchanged.

Host tests and renders cover the submenu; manual V0.11 and docs updated.

Co-Authored-By: Claude Opus 5.5 (1M context) <noreply@anthropic.com>
Claude-Session: https://claude.ai/code/session_01SeagWfrqs6mRKCaMXCWNLt
</commit_message>
<xml_diff>
--- a/Documentation/User Manual/TurnHub Manual V0.11.docx
+++ b/Documentation/User Manual/TurnHub Manual V0.11.docx
@@ -2466,7 +2466,7 @@
         <w:t xml:space="preserve">Menu</w:t>
       </w:r>
       <w:r>
-        <w:t xml:space="preserve">, a scrolling list of everything you can do right now (such as Pause, Claim win, Link phone or Leave lobby), followed by the Sigil's own Sleep, Unpair and Factory reset. Push Up or Down to move through it, click (or push Right) to choose the highlighted line, and push Left to go back. The top line counts where you are in the list, and lines you must hold say (hold). Choosing an action closes the list. The bottom line of the screen names one key at a time, starting with the click, and moves on every few seconds.</w:t>
+        <w:t xml:space="preserve">, a scrolling list of everything you can do right now (such as Pause, Claim win, Link phone or Leave lobby), followed by the Sigil's own Sleep and Device recovery. Push Up or Down to move through it, click (or push Right) to choose the highlighted line, and push Left to go back. The top line counts where you are in the list, and lines you must hold say (hold). Choosing an action closes the list. The bottom line of the screen names one key at a time, starting with the click, and moves on every few seconds.</w:t>
       </w:r>
     </w:p>
     <w:p>
@@ -2497,7 +2497,7 @@
         <w:t xml:space="preserve">Menu</w:t>
       </w:r>
       <w:r>
-        <w:t xml:space="preserve"> and opens it. On the OLED Sigil the same entries end its Menu list, which opens with Up at any time, even during a game.</w:t>
+        <w:t xml:space="preserve"> and opens it. On the OLED Sigil, Sleep ends its Menu list, which opens with Up at any time, even during a game, and Unpair and Factory reset sit one step further in, under Device recovery, so they stay out of the way of play.</w:t>
       </w:r>
     </w:p>
     <w:p>
@@ -2581,7 +2581,7 @@
         <w:t xml:space="preserve">Back:</w:t>
       </w:r>
       <w:r>
-        <w:t xml:space="preserve"> push Left to close the menu (or choose Back at the end of the OLED list). It also closes by itself after 10 seconds.</w:t>
+        <w:t xml:space="preserve"> push Left to close the menu (or choose Back at the end of the OLED list; in Device recovery, Back and Left return to Menu). It also closes by itself after 10 seconds.</w:t>
       </w:r>
     </w:p>
     <w:p>

</xml_diff>

<commit_message>
Fix shared seat order and add Sigil Commander damage entry
</commit_message>
<xml_diff>
--- a/Documentation/User Manual/TurnHub Manual V0.11.docx
+++ b/Documentation/User Manual/TurnHub Manual V0.11.docx
@@ -1695,6 +1695,9 @@
       <w:r>
         <w:t xml:space="preserve"> from its menu for the second player. The screen shows both names, and prompts say which seat (A or B) they are for. </w:t>
       </w:r>
+      <w:r>
+        <w:t>In the lobby, tap either player on the Atlas screen to set turn order. Earlier and Later can swap A and B; moving past their pair moves the whole Sigil. Choose B left for B to take its turn before A, or B right for B to follow A. Both seats stay next to each other in turn order. Set this before starting the game. The order is kept for a rematch.</w:t>
+      </w:r>
     </w:p>
     <w:p>
       <w:pPr>
@@ -6320,6 +6323,29 @@
           <w:rStyle w:val="Strong"/>
         </w:rPr>
         <w:t>Product names and specifications subject to change.</w:t>
+      </w:r>
+    </w:p>
+    <w:p>
+      <w:pPr>
+        <w:pStyle w:val="Heading2"/>
+      </w:pPr>
+      <w:r>
+        <w:t>Commander damage from a Sigil</w:t>
+      </w:r>
+    </w:p>
+    <w:p>
+      <w:r>
+        <w:t>Record damage on the Sigil of the player who received it. On a shared Sigil, first show the correct seat with Switch seat. OLED: press Up for the action list and choose Cmd damage. E-ink: press Up for Game menu, then click for Cmd damage. The receiving name and A/B seat stay fixed while you enter the hit.</w:t>
+      </w:r>
+    </w:p>
+    <w:p>
+      <w:r>
+        <w:t>Use Left/Right to select who hit you, click, select Commander 1 or 2 (2 for a partner), click, then enter the amount. Hold Left/Right to repeat. Click to review the life and Commander damage totals; click again to apply both together. Up goes back; Down cancels. This works during anyone’s turn without pausing the game.</w:t>
+      </w:r>
+    </w:p>
+    <w:p>
+      <w:r>
+        <w:t>Undo hit previews and reverses the last hit recorded this way for the shown seat. It restores the life lost and removes that Commander damage together. A correction to the same damage entry removes that undo option. Entry pages and Undo clear on a restart or new match; recovered life and damage totals remain. Recording 21 Commander damage does not automatically eliminate a player.</w:t>
       </w:r>
     </w:p>
     <w:sectPr>

</xml_diff>

<commit_message>
Two-Headed Giant: portal, Android, docs and manual; Atlas 0.6.11
Teams of two neighbours in turn order share one life total (30, or 60
for Commander) and one turn; either teammate passes, claims the win or
cancels the team's pass. Eliminating one teammate eliminates the team,
and both get the win. Commander damage stays per player and comes off
the team's life.

The portal and app gain a Two-Headed Giant switch in Game setup and show
teams on the Players list; the state carries settings.twoHeadedGiant and
players[].team. Sigils need no new firmware. Storage keeps the flag in
the profile byte's top bit, so no factory reset is needed.

Co-Authored-By: Claude Opus 5.5 (1M context) <noreply@anthropic.com>
Claude-Session: https://claude.ai/code/session_012RpwsQujBeXUYcZzg7e3Cr
</commit_message>
<xml_diff>
--- a/Documentation/User Manual/TurnHub Manual V0.11.docx
+++ b/Documentation/User Manual/TurnHub Manual V0.11.docx
@@ -1996,6 +1996,89 @@
       </w:pPr>
       <w:r>
         <w:t xml:space="preserve">Changes to the game settings apply from the next game that starts.</w:t>
+      </w:r>
+    </w:p>
+    <w:p>
+      <w:pPr>
+        <w:pStyle w:val="NormalWeb"/>
+      </w:pPr>
+      <w:r>
+        <w:t xml:space="preserve">Two-Headed Giant (Magic and Commander): turn it on in Game setup for teams of two. Players 1 and 2 are a team, then 3 and 4, and so on; change the turn order in the lobby to change teams. It needs an even number of players, at least 4.</w:t>
+      </w:r>
+    </w:p>
+    <w:p>
+      <w:pPr>
+        <w:numPr>
+          <w:ilvl w:val="0"/>
+          <w:numId w:val="1"/>
+        </w:numPr>
+        <w:spacing w:before="100" w:beforeAutospacing="1" w:after="100" w:afterAutospacing="1" w:line="240" w:lineRule="auto"/>
+        <w:rPr>
+          <w:rFonts w:eastAsia="Times New Roman"/>
+        </w:rPr>
+      </w:pPr>
+      <w:r>
+        <w:t xml:space="preserve">Teammates share one life total: 30 for Magic, 60 for Commander (you can change it). Either teammate can change it.</w:t>
+      </w:r>
+    </w:p>
+    <w:p>
+      <w:pPr>
+        <w:numPr>
+          <w:ilvl w:val="0"/>
+          <w:numId w:val="1"/>
+        </w:numPr>
+        <w:spacing w:before="100" w:beforeAutospacing="1" w:after="100" w:afterAutospacing="1" w:line="240" w:lineRule="auto"/>
+        <w:rPr>
+          <w:rFonts w:eastAsia="Times New Roman"/>
+        </w:rPr>
+      </w:pPr>
+      <w:r>
+        <w:t xml:space="preserve">Teammates take their turn together. Both see “Your turn”, and either can pass, cancel the pass or claim the win.</w:t>
+      </w:r>
+    </w:p>
+    <w:p>
+      <w:pPr>
+        <w:numPr>
+          <w:ilvl w:val="0"/>
+          <w:numId w:val="1"/>
+        </w:numPr>
+        <w:spacing w:before="100" w:beforeAutospacing="1" w:after="100" w:afterAutospacing="1" w:line="240" w:lineRule="auto"/>
+        <w:rPr>
+          <w:rFonts w:eastAsia="Times New Roman"/>
+        </w:rPr>
+      </w:pPr>
+      <w:r>
+        <w:t xml:space="preserve">Commander damage still counts per player, and each hit comes off the team’s life.</w:t>
+      </w:r>
+    </w:p>
+    <w:p>
+      <w:pPr>
+        <w:numPr>
+          <w:ilvl w:val="0"/>
+          <w:numId w:val="1"/>
+        </w:numPr>
+        <w:spacing w:before="100" w:beforeAutospacing="1" w:after="100" w:afterAutospacing="1" w:line="240" w:lineRule="auto"/>
+        <w:rPr>
+          <w:rFonts w:eastAsia="Times New Roman"/>
+        </w:rPr>
+      </w:pPr>
+      <w:r>
+        <w:t xml:space="preserve">When one teammate is eliminated or concedes, the whole team is out. The last team left wins, and both teammates get the win.</w:t>
+      </w:r>
+    </w:p>
+    <w:p>
+      <w:pPr>
+        <w:numPr>
+          <w:ilvl w:val="0"/>
+          <w:numId w:val="1"/>
+        </w:numPr>
+        <w:spacing w:before="100" w:beforeAutospacing="1" w:after="100" w:afterAutospacing="1" w:line="240" w:lineRule="auto"/>
+        <w:rPr>
+          <w:rFonts w:eastAsia="Times New Roman"/>
+        </w:rPr>
+      </w:pPr>
+      <w:r>
+        <w:t xml:space="preserve">The starting team skips its first draw; the Atlas screen reminds you during that first turn.</w:t>
       </w:r>
     </w:p>
     <w:p>

</xml_diff>